<commit_message>
docs: đồng bộ tài liệu với implementation hiện tại
Cập nhật SRS, UML, thiết kế CSDL, RTM, kiến trúc, UI/UX và 5 DOCX canonical theo các luồng booking, check-in, password reset, tồn kho, hóa đơn và SQL Server đang triển khai; đồng thời tách rõ VNPay, Rating và WebSocket khỏi phạm vi đã hoàn thành.
</commit_message>
<xml_diff>
--- a/docs/generated/MedClinic_DacTaUseCase.docx
+++ b/docs/generated/MedClinic_DacTaUseCase.docx
@@ -2179,51 +2179,51 @@
                 <w:rFonts w:ascii="Times New Roman" w:hAnsi="Times New Roman"/>
                 <w:sz w:val="22"/>
               </w:rPr>
-              <w:t xml:space="preserve">Đánh giá &amp; Phản hồi bác sĩ</w:t>
-            </w:r>
-          </w:p>
-        </w:tc>
-        <w:tc>
-          <w:tcPr>
-            <w:tcMar>
-              <w:top w:w="120" w:type="dxa"/>
-              <w:bottom w:w="120" w:type="dxa"/>
-              <w:left w:w="160" w:type="dxa"/>
-              <w:right w:w="160" w:type="dxa"/>
-            </w:tcMar>
-          </w:tcPr>
-          <w:p>
-            <w:pPr>
-              <w:spacing w:line="240" w:lineRule="auto" w:after="40"/>
-            </w:pPr>
-            <w:r>
-              <w:rPr>
-                <w:rFonts w:ascii="Times New Roman" w:hAnsi="Times New Roman"/>
-                <w:sz w:val="22"/>
-              </w:rPr>
-              <w:t xml:space="preserve">Bệnh nhân</w:t>
-            </w:r>
-          </w:p>
-        </w:tc>
-        <w:tc>
-          <w:tcPr>
-            <w:tcMar>
-              <w:top w:w="120" w:type="dxa"/>
-              <w:bottom w:w="120" w:type="dxa"/>
-              <w:left w:w="160" w:type="dxa"/>
-              <w:right w:w="160" w:type="dxa"/>
-            </w:tcMar>
-          </w:tcPr>
-          <w:p>
-            <w:pPr>
-              <w:spacing w:line="240" w:lineRule="auto" w:after="40"/>
-            </w:pPr>
-            <w:r>
-              <w:rPr>
-                <w:rFonts w:ascii="Times New Roman" w:hAnsi="Times New Roman"/>
-                <w:sz w:val="22"/>
-              </w:rPr>
-              <w:t xml:space="preserve">Chăm sóc khách hàng</w:t>
+              <w:t xml:space="preserve">Xem lịch trực cá nhân</w:t>
+            </w:r>
+          </w:p>
+        </w:tc>
+        <w:tc>
+          <w:tcPr>
+            <w:tcMar>
+              <w:top w:w="120" w:type="dxa"/>
+              <w:bottom w:w="120" w:type="dxa"/>
+              <w:left w:w="160" w:type="dxa"/>
+              <w:right w:w="160" w:type="dxa"/>
+            </w:tcMar>
+          </w:tcPr>
+          <w:p>
+            <w:pPr>
+              <w:spacing w:line="240" w:lineRule="auto" w:after="40"/>
+            </w:pPr>
+            <w:r>
+              <w:rPr>
+                <w:rFonts w:ascii="Times New Roman" w:hAnsi="Times New Roman"/>
+                <w:sz w:val="22"/>
+              </w:rPr>
+              <w:t xml:space="preserve">Bác sĩ (Doctor)</w:t>
+            </w:r>
+          </w:p>
+        </w:tc>
+        <w:tc>
+          <w:tcPr>
+            <w:tcMar>
+              <w:top w:w="120" w:type="dxa"/>
+              <w:bottom w:w="120" w:type="dxa"/>
+              <w:left w:w="160" w:type="dxa"/>
+              <w:right w:w="160" w:type="dxa"/>
+            </w:tcMar>
+          </w:tcPr>
+          <w:p>
+            <w:pPr>
+              <w:spacing w:line="240" w:lineRule="auto" w:after="40"/>
+            </w:pPr>
+            <w:r>
+              <w:rPr>
+                <w:rFonts w:ascii="Times New Roman" w:hAnsi="Times New Roman"/>
+                <w:sz w:val="22"/>
+              </w:rPr>
+              <w:t xml:space="preserve">Lịch làm việc</w:t>
             </w:r>
           </w:p>
         </w:tc>
@@ -2359,7 +2359,7 @@
                 <w:rFonts w:ascii="Times New Roman" w:hAnsi="Times New Roman"/>
                 <w:sz w:val="22"/>
               </w:rPr>
-              <w:t xml:space="preserve">Quản lý Bác sĩ &amp; Phân lịch trực</w:t>
+              <w:t xml:space="preserve">Quản lý Hồ sơ Bác sĩ</w:t>
             </w:r>
           </w:p>
         </w:tc>
@@ -4689,7 +4689,7 @@
                 <w:rFonts w:ascii="Times New Roman" w:hAnsi="Times New Roman"/>
                 <w:sz w:val="22"/>
               </w:rPr>
-              <w:t xml:space="preserve">4. Hệ thống xác thực email và gửi liên kết đặt lại mật khẩu về email người dùng</w:t>
+              <w:t xml:space="preserve">4. Hệ thống luôn phản hồi chung; nếu email tồn tại thì tạo token thô, chỉ lưu SHA-256 hash và gửi liên kết đặt lại mật khẩu</w:t>
             </w:r>
           </w:p>
           <w:p>
@@ -4841,19 +4841,7 @@
                 <w:rFonts w:ascii="Times New Roman" w:hAnsi="Times New Roman"/>
                 <w:sz w:val="22"/>
               </w:rPr>
-              <w:t xml:space="preserve">4b. Email không tồn tại trong hệ thống</w:t>
-            </w:r>
-          </w:p>
-          <w:p>
-            <w:pPr>
-              <w:spacing w:line="240" w:lineRule="auto" w:after="40"/>
-            </w:pPr>
-            <w:r>
-              <w:rPr>
-                <w:rFonts w:ascii="Times New Roman" w:hAnsi="Times New Roman"/>
-                <w:sz w:val="22"/>
-              </w:rPr>
-              <w:t xml:space="preserve">4b1. Thông báo không tìm thấy tài khoản với email này</w:t>
+              <w:t xml:space="preserve">N/A - response không tiết lộ email có tồn tại hay không</w:t>
             </w:r>
           </w:p>
         </w:tc>
@@ -6729,7 +6717,7 @@
                 <w:rFonts w:ascii="Times New Roman" w:hAnsi="Times New Roman"/>
                 <w:sz w:val="22"/>
               </w:rPr>
-              <w:t xml:space="preserve">1. Vào trang Đặt lịch khám (/patient/book-appointment)</w:t>
+              <w:t xml:space="preserve">1. Vào trang Đặt lịch khám (/patient/booking)</w:t>
             </w:r>
           </w:p>
           <w:p>
@@ -7827,7 +7815,7 @@
                 <w:rFonts w:ascii="Times New Roman" w:hAnsi="Times New Roman"/>
                 <w:sz w:val="22"/>
               </w:rPr>
-              <w:t xml:space="preserve">1. Vào mục Hồ sơ bệnh án (/patient/medical-records)</w:t>
+              <w:t xml:space="preserve">1. Vào mục Hồ sơ bệnh án (/patient/medical-history)</w:t>
             </w:r>
           </w:p>
           <w:p>
@@ -8841,7 +8829,7 @@
                 <w:rFonts w:ascii="Times New Roman" w:hAnsi="Times New Roman"/>
                 <w:sz w:val="22"/>
               </w:rPr>
-              <w:t xml:space="preserve">4. Hệ thống đếm số lượng ca khám trong ngày và cấp mã STT tự động (VD: STT-01, STT-02)</w:t>
+              <w:t xml:space="preserve">4. Hệ thống dùng DailyQueueCounterAllocator cấp queue_sequence duy nhất theo ngày và định dạng STT tự động (VD: STT-01, STT-02)</w:t>
             </w:r>
           </w:p>
           <w:p>
@@ -10881,19 +10869,19 @@
                 <w:rFonts w:ascii="Times New Roman" w:hAnsi="Times New Roman"/>
                 <w:sz w:val="22"/>
               </w:rPr>
-              <w:t xml:space="preserve">7. Hệ thống kiểm tra tồn kho của từng loại thuốc trong bảng medicines</w:t>
-            </w:r>
-          </w:p>
-          <w:p>
-            <w:pPr>
-              <w:spacing w:line="240" w:lineRule="auto" w:after="40"/>
-            </w:pPr>
-            <w:r>
-              <w:rPr>
-                <w:rFonts w:ascii="Times New Roman" w:hAnsi="Times New Roman"/>
-                <w:sz w:val="22"/>
-              </w:rPr>
-              <w:t xml:space="preserve">8. Trừ số lượng tồn kho tương ứng trong CSDL</w:t>
+              <w:t xml:space="preserve">7. Hệ thống khóa từng Medicine bằng findByIdForUpdate(), kiểm tra active và tổng số lượng cần kê</w:t>
+            </w:r>
+          </w:p>
+          <w:p>
+            <w:pPr>
+              <w:spacing w:line="240" w:lineRule="auto" w:after="40"/>
+            </w:pPr>
+            <w:r>
+              <w:rPr>
+                <w:rFonts w:ascii="Times New Roman" w:hAnsi="Times New Roman"/>
+                <w:sz w:val="22"/>
+              </w:rPr>
+              <w:t xml:space="preserve">8. Trừ tồn kho trong cùng transaction và snapshot unit_price_at_time</w:t>
             </w:r>
           </w:p>
           <w:p>
@@ -11895,7 +11883,7 @@
                 <w:rFonts w:ascii="Times New Roman" w:hAnsi="Times New Roman"/>
                 <w:sz w:val="22"/>
               </w:rPr>
-              <w:t xml:space="preserve">5. Sinh mã hóa đơn duy nhất và lưu vào bảng invoices với trạng thái UNPAID</w:t>
+              <w:t xml:space="preserve">5. Reserve mã hóa đơn duy nhất qua invoice_code_reservations rồi lưu Invoice trạng thái UNPAID</w:t>
             </w:r>
           </w:p>
           <w:p>
@@ -12164,7 +12152,7 @@
                 <w:rFonts w:ascii="Times New Roman" w:hAnsi="Times New Roman"/>
                 <w:sz w:val="22"/>
               </w:rPr>
-              <w:t xml:space="preserve">Lễ tân thu tiền mặt hoặc xác nhận thanh toán trực tuyến cho ca khám</w:t>
+              <w:t xml:space="preserve">Lễ tân thu tiền mặt cho ca khám đã có hóa đơn</w:t>
             </w:r>
           </w:p>
         </w:tc>
@@ -12360,43 +12348,43 @@
                 <w:rFonts w:ascii="Times New Roman" w:hAnsi="Times New Roman"/>
                 <w:sz w:val="22"/>
               </w:rPr>
-              <w:t xml:space="preserve">2. Tìm kiếm hóa đơn theo mã lịch hẹn hoặc tên bệnh nhân</w:t>
-            </w:r>
-          </w:p>
-          <w:p>
-            <w:pPr>
-              <w:spacing w:line="240" w:lineRule="auto" w:after="40"/>
-            </w:pPr>
-            <w:r>
-              <w:rPr>
-                <w:rFonts w:ascii="Times New Roman" w:hAnsi="Times New Roman"/>
-                <w:sz w:val="22"/>
-              </w:rPr>
-              <w:t xml:space="preserve">3. Lễ tân chọn phương thức thanh toán: Tiền mặt tại quầy (CASH) hoặc Cổng VNPAY</w:t>
-            </w:r>
-          </w:p>
-          <w:p>
-            <w:pPr>
-              <w:spacing w:line="240" w:lineRule="auto" w:after="40"/>
-            </w:pPr>
-            <w:r>
-              <w:rPr>
-                <w:rFonts w:ascii="Times New Roman" w:hAnsi="Times New Roman"/>
-                <w:sz w:val="22"/>
-              </w:rPr>
-              <w:t xml:space="preserve">4. Thu tiền từ bệnh nhân và bấm Xác nhận thanh toán</w:t>
-            </w:r>
-          </w:p>
-          <w:p>
-            <w:pPr>
-              <w:spacing w:line="240" w:lineRule="auto" w:after="40"/>
-            </w:pPr>
-            <w:r>
-              <w:rPr>
-                <w:rFonts w:ascii="Times New Roman" w:hAnsi="Times New Roman"/>
-                <w:sz w:val="22"/>
-              </w:rPr>
-              <w:t xml:space="preserve">5. Hệ thống cập nhật trạng thái hóa đơn sang PAID, lưu thời điểm paidAt</w:t>
+              <w:t xml:space="preserve">2. Chọn hóa đơn UNPAID</w:t>
+            </w:r>
+          </w:p>
+          <w:p>
+            <w:pPr>
+              <w:spacing w:line="240" w:lineRule="auto" w:after="40"/>
+            </w:pPr>
+            <w:r>
+              <w:rPr>
+                <w:rFonts w:ascii="Times New Roman" w:hAnsi="Times New Roman"/>
+                <w:sz w:val="22"/>
+              </w:rPr>
+              <w:t xml:space="preserve">3. Chọn phương thức CASH</w:t>
+            </w:r>
+          </w:p>
+          <w:p>
+            <w:pPr>
+              <w:spacing w:line="240" w:lineRule="auto" w:after="40"/>
+            </w:pPr>
+            <w:r>
+              <w:rPr>
+                <w:rFonts w:ascii="Times New Roman" w:hAnsi="Times New Roman"/>
+                <w:sz w:val="22"/>
+              </w:rPr>
+              <w:t xml:space="preserve">4. Bấm Xác nhận đã thu</w:t>
+            </w:r>
+          </w:p>
+          <w:p>
+            <w:pPr>
+              <w:spacing w:line="240" w:lineRule="auto" w:after="40"/>
+            </w:pPr>
+            <w:r>
+              <w:rPr>
+                <w:rFonts w:ascii="Times New Roman" w:hAnsi="Times New Roman"/>
+                <w:sz w:val="22"/>
+              </w:rPr>
+              <w:t xml:space="preserve">5. InvoiceService khóa hóa đơn, kiểm tra trạng thái và cập nhật PAID + paidAt</w:t>
             </w:r>
           </w:p>
           <w:p>
@@ -12454,31 +12442,7 @@
                 <w:rFonts w:ascii="Times New Roman" w:hAnsi="Times New Roman"/>
                 <w:sz w:val="22"/>
               </w:rPr>
-              <w:t xml:space="preserve">3a. Bệnh nhân chọn thanh toán online qua VNPay Sandbox</w:t>
-            </w:r>
-          </w:p>
-          <w:p>
-            <w:pPr>
-              <w:spacing w:line="240" w:lineRule="auto" w:after="40"/>
-            </w:pPr>
-            <w:r>
-              <w:rPr>
-                <w:rFonts w:ascii="Times New Roman" w:hAnsi="Times New Roman"/>
-                <w:sz w:val="22"/>
-              </w:rPr>
-              <w:t xml:space="preserve">3a1. Quét mã QR thanh toán hoặc nhập thông tin thẻ test</w:t>
-            </w:r>
-          </w:p>
-          <w:p>
-            <w:pPr>
-              <w:spacing w:line="240" w:lineRule="auto" w:after="40"/>
-            </w:pPr>
-            <w:r>
-              <w:rPr>
-                <w:rFonts w:ascii="Times New Roman" w:hAnsi="Times New Roman"/>
-                <w:sz w:val="22"/>
-              </w:rPr>
-              <w:t xml:space="preserve">3a2. Cổng thanh toán gửi IPN xác nhận thành công</w:t>
+              <w:t xml:space="preserve">Phương thức khác (ví dụ VNPAY) hiện bị service từ chối và thuộc roadmap</w:t>
             </w:r>
           </w:p>
         </w:tc>
@@ -13013,7 +12977,7 @@
           <w:b/>
           <w:sz w:val="26"/>
         </w:rPr>
-        <w:t xml:space="preserve">Đặc tả UC_021: Đánh giá &amp; Phản hồi bác sĩ (Review &amp; Rating)</w:t>
+        <w:t xml:space="preserve">Đặc tả UC_021: Xem lịch trực cá nhân (Doctor Schedule)</w:t>
       </w:r>
     </w:p>
     <w:tbl>
@@ -13108,7 +13072,7 @@
                 <w:rFonts w:ascii="Times New Roman" w:hAnsi="Times New Roman"/>
                 <w:sz w:val="22"/>
               </w:rPr>
-              <w:t xml:space="preserve">Đánh giá &amp; Phản hồi bác sĩ (Review &amp; Rating)</w:t>
+              <w:t xml:space="preserve">Xem lịch trực cá nhân (Doctor Schedule)</w:t>
             </w:r>
           </w:p>
         </w:tc>
@@ -13154,7 +13118,7 @@
                 <w:rFonts w:ascii="Times New Roman" w:hAnsi="Times New Roman"/>
                 <w:sz w:val="22"/>
               </w:rPr>
-              <w:t xml:space="preserve">Bệnh nhân chấm sao và nhận xét chất lượng khám sau khi hoàn tất</w:t>
+              <w:t xml:space="preserve">Bác sĩ xem lịch phân ca và các TimeSlot đã được lưu trong 14 ngày tới</w:t>
             </w:r>
           </w:p>
         </w:tc>
@@ -13200,7 +13164,7 @@
                 <w:rFonts w:ascii="Times New Roman" w:hAnsi="Times New Roman"/>
                 <w:sz w:val="22"/>
               </w:rPr>
-              <w:t xml:space="preserve">Bệnh nhân (ROLE_PATIENT)</w:t>
+              <w:t xml:space="preserve">Bác sĩ (ROLE_DOCTOR)</w:t>
             </w:r>
           </w:p>
         </w:tc>
@@ -13246,7 +13210,7 @@
                 <w:rFonts w:ascii="Times New Roman" w:hAnsi="Times New Roman"/>
                 <w:sz w:val="22"/>
               </w:rPr>
-              <w:t xml:space="preserve">Ca khám đã hoàn tất (status = COMPLETED)</w:t>
+              <w:t xml:space="preserve">Đã đăng nhập với quyền DOCTOR</w:t>
             </w:r>
           </w:p>
         </w:tc>
@@ -13292,7 +13256,7 @@
                 <w:rFonts w:ascii="Times New Roman" w:hAnsi="Times New Roman"/>
                 <w:sz w:val="22"/>
               </w:rPr>
-              <w:t xml:space="preserve">Đánh giá được ghi nhận và cập nhật vào điểm trung bình của bác sĩ</w:t>
+              <w:t xml:space="preserve">Hiển thị lịch trực cá nhân theo khoảng ngày</w:t>
             </w:r>
           </w:p>
         </w:tc>
@@ -13338,67 +13302,43 @@
                 <w:rFonts w:ascii="Times New Roman" w:hAnsi="Times New Roman"/>
                 <w:sz w:val="22"/>
               </w:rPr>
-              <w:t xml:space="preserve">1. Bệnh nhân vào trang Chi tiết lịch hẹn đã khám</w:t>
-            </w:r>
-          </w:p>
-          <w:p>
-            <w:pPr>
-              <w:spacing w:line="240" w:lineRule="auto" w:after="40"/>
-            </w:pPr>
-            <w:r>
-              <w:rPr>
-                <w:rFonts w:ascii="Times New Roman" w:hAnsi="Times New Roman"/>
-                <w:sz w:val="22"/>
-              </w:rPr>
-              <w:t xml:space="preserve">2. Bấm nút Đánh giá bác sĩ</w:t>
-            </w:r>
-          </w:p>
-          <w:p>
-            <w:pPr>
-              <w:spacing w:line="240" w:lineRule="auto" w:after="40"/>
-            </w:pPr>
-            <w:r>
-              <w:rPr>
-                <w:rFonts w:ascii="Times New Roman" w:hAnsi="Times New Roman"/>
-                <w:sz w:val="22"/>
-              </w:rPr>
-              <w:t xml:space="preserve">3. Chọn số sao đánh giá (từ 1 đến 5 sao)</w:t>
-            </w:r>
-          </w:p>
-          <w:p>
-            <w:pPr>
-              <w:spacing w:line="240" w:lineRule="auto" w:after="40"/>
-            </w:pPr>
-            <w:r>
-              <w:rPr>
-                <w:rFonts w:ascii="Times New Roman" w:hAnsi="Times New Roman"/>
-                <w:sz w:val="22"/>
-              </w:rPr>
-              <w:t xml:space="preserve">4. Nhập nội dung nhận xét, góp ý về thái độ và chuyên môn của bác sĩ</w:t>
-            </w:r>
-          </w:p>
-          <w:p>
-            <w:pPr>
-              <w:spacing w:line="240" w:lineRule="auto" w:after="40"/>
-            </w:pPr>
-            <w:r>
-              <w:rPr>
-                <w:rFonts w:ascii="Times New Roman" w:hAnsi="Times New Roman"/>
-                <w:sz w:val="22"/>
-              </w:rPr>
-              <w:t xml:space="preserve">5. Bấm Gửi đánh giá</w:t>
-            </w:r>
-          </w:p>
-          <w:p>
-            <w:pPr>
-              <w:spacing w:line="240" w:lineRule="auto" w:after="40"/>
-            </w:pPr>
-            <w:r>
-              <w:rPr>
-                <w:rFonts w:ascii="Times New Roman" w:hAnsi="Times New Roman"/>
-                <w:sz w:val="22"/>
-              </w:rPr>
-              <w:t xml:space="preserve">6. Hệ thống lưu đánh giá và cập nhật hiển thị trên trang thông tin bác sĩ</w:t>
+              <w:t xml:space="preserve">1. Bác sĩ mở mục Lịch trực (/doctor/schedule)</w:t>
+            </w:r>
+          </w:p>
+          <w:p>
+            <w:pPr>
+              <w:spacing w:line="240" w:lineRule="auto" w:after="40"/>
+            </w:pPr>
+            <w:r>
+              <w:rPr>
+                <w:rFonts w:ascii="Times New Roman" w:hAnsi="Times New Roman"/>
+                <w:sz w:val="22"/>
+              </w:rPr>
+              <w:t xml:space="preserve">2. Hệ thống xác định DoctorProfile từ tài khoản đăng nhập</w:t>
+            </w:r>
+          </w:p>
+          <w:p>
+            <w:pPr>
+              <w:spacing w:line="240" w:lineRule="auto" w:after="40"/>
+            </w:pPr>
+            <w:r>
+              <w:rPr>
+                <w:rFonts w:ascii="Times New Roman" w:hAnsi="Times New Roman"/>
+                <w:sz w:val="22"/>
+              </w:rPr>
+              <w:t xml:space="preserve">3. ScheduleService.findByDoctorAndDateRange() tải lịch từ hôm nay đến 14 ngày tới</w:t>
+            </w:r>
+          </w:p>
+          <w:p>
+            <w:pPr>
+              <w:spacing w:line="240" w:lineRule="auto" w:after="40"/>
+            </w:pPr>
+            <w:r>
+              <w:rPr>
+                <w:rFonts w:ascii="Times New Roman" w:hAnsi="Times New Roman"/>
+                <w:sz w:val="22"/>
+              </w:rPr>
+              <w:t xml:space="preserve">4. Giao diện hiển thị ca làm việc và TimeSlot tương ứng</w:t>
             </w:r>
           </w:p>
         </w:tc>
@@ -14051,7 +13991,7 @@
           <w:b/>
           <w:sz w:val="26"/>
         </w:rPr>
-        <w:t xml:space="preserve">Đặc tả UC_023: Quản lý Bác sĩ &amp; Phân lịch trực (Doctor Management)</w:t>
+        <w:t xml:space="preserve">Đặc tả UC_023: Quản lý Hồ sơ Bác sĩ (Doctor Management)</w:t>
       </w:r>
     </w:p>
     <w:tbl>
@@ -14146,7 +14086,7 @@
                 <w:rFonts w:ascii="Times New Roman" w:hAnsi="Times New Roman"/>
                 <w:sz w:val="22"/>
               </w:rPr>
-              <w:t xml:space="preserve">Quản lý Bác sĩ &amp; Phân lịch trực (Doctor Management)</w:t>
+              <w:t xml:space="preserve">Quản lý Hồ sơ Bác sĩ (Doctor Management)</w:t>
             </w:r>
           </w:p>
         </w:tc>
@@ -14192,7 +14132,7 @@
                 <w:rFonts w:ascii="Times New Roman" w:hAnsi="Times New Roman"/>
                 <w:sz w:val="22"/>
               </w:rPr>
-              <w:t xml:space="preserve">Admin quản lý hồ sơ chuyên môn bác sĩ và thiết lập lịch làm việc</w:t>
+              <w:t xml:space="preserve">Admin tạo tài khoản/hồ sơ bác sĩ và cập nhật thông tin chuyên môn</w:t>
             </w:r>
           </w:p>
         </w:tc>
@@ -14330,7 +14270,7 @@
                 <w:rFonts w:ascii="Times New Roman" w:hAnsi="Times New Roman"/>
                 <w:sz w:val="22"/>
               </w:rPr>
-              <w:t xml:space="preserve">Hồ sơ bác sĩ và lịch trực được cập nhật</w:t>
+              <w:t xml:space="preserve">Hồ sơ bác sĩ được tạo hoặc cập nhật</w:t>
             </w:r>
           </w:p>
         </w:tc>
@@ -14376,67 +14316,55 @@
                 <w:rFonts w:ascii="Times New Roman" w:hAnsi="Times New Roman"/>
                 <w:sz w:val="22"/>
               </w:rPr>
-              <w:t xml:space="preserve">1. Admin vào mục Quản lý bác sĩ (/admin/doctors)</w:t>
-            </w:r>
-          </w:p>
-          <w:p>
-            <w:pPr>
-              <w:spacing w:line="240" w:lineRule="auto" w:after="40"/>
-            </w:pPr>
-            <w:r>
-              <w:rPr>
-                <w:rFonts w:ascii="Times New Roman" w:hAnsi="Times New Roman"/>
-                <w:sz w:val="22"/>
-              </w:rPr>
-              <w:t xml:space="preserve">2. Xem danh sách các bác sĩ và chuyên khoa trực thuộc</w:t>
-            </w:r>
-          </w:p>
-          <w:p>
-            <w:pPr>
-              <w:spacing w:line="240" w:lineRule="auto" w:after="40"/>
-            </w:pPr>
-            <w:r>
-              <w:rPr>
-                <w:rFonts w:ascii="Times New Roman" w:hAnsi="Times New Roman"/>
-                <w:sz w:val="22"/>
-              </w:rPr>
-              <w:t xml:space="preserve">3. Bấm Thêm bác sĩ mới hoặc chỉnh sửa bác sĩ hiện có</w:t>
-            </w:r>
-          </w:p>
-          <w:p>
-            <w:pPr>
-              <w:spacing w:line="240" w:lineRule="auto" w:after="40"/>
-            </w:pPr>
-            <w:r>
-              <w:rPr>
-                <w:rFonts w:ascii="Times New Roman" w:hAnsi="Times New Roman"/>
-                <w:sz w:val="22"/>
-              </w:rPr>
-              <w:t xml:space="preserve">4. Cập nhật học hàm, kinh nghiệm, chuyên khoa phụ trách, phí khám tư vấn và tiểu sử</w:t>
-            </w:r>
-          </w:p>
-          <w:p>
-            <w:pPr>
-              <w:spacing w:line="240" w:lineRule="auto" w:after="40"/>
-            </w:pPr>
-            <w:r>
-              <w:rPr>
-                <w:rFonts w:ascii="Times New Roman" w:hAnsi="Times New Roman"/>
-                <w:sz w:val="22"/>
-              </w:rPr>
-              <w:t xml:space="preserve">5. Bấm Lưu thông tin bác sĩ</w:t>
-            </w:r>
-          </w:p>
-          <w:p>
-            <w:pPr>
-              <w:spacing w:line="240" w:lineRule="auto" w:after="40"/>
-            </w:pPr>
-            <w:r>
-              <w:rPr>
-                <w:rFonts w:ascii="Times New Roman" w:hAnsi="Times New Roman"/>
-                <w:sz w:val="22"/>
-              </w:rPr>
-              <w:t xml:space="preserve">6. Hệ thống tự động kích hoạt sinh lịch trực ca sáng và ca chiều trong 14 ngày</w:t>
+              <w:t xml:space="preserve">1. Admin vào /admin/doctors</w:t>
+            </w:r>
+          </w:p>
+          <w:p>
+            <w:pPr>
+              <w:spacing w:line="240" w:lineRule="auto" w:after="40"/>
+            </w:pPr>
+            <w:r>
+              <w:rPr>
+                <w:rFonts w:ascii="Times New Roman" w:hAnsi="Times New Roman"/>
+                <w:sz w:val="22"/>
+              </w:rPr>
+              <w:t xml:space="preserve">2. Tạo bác sĩ mới với username, email, SĐT, giấy phép hành nghề, chuyên khoa, học hàm, kinh nghiệm và phí khám</w:t>
+            </w:r>
+          </w:p>
+          <w:p>
+            <w:pPr>
+              <w:spacing w:line="240" w:lineRule="auto" w:after="40"/>
+            </w:pPr>
+            <w:r>
+              <w:rPr>
+                <w:rFonts w:ascii="Times New Roman" w:hAnsi="Times New Roman"/>
+                <w:sz w:val="22"/>
+              </w:rPr>
+              <w:t xml:space="preserve">3. Hệ thống kiểm tra trùng username/email/SĐT/license</w:t>
+            </w:r>
+          </w:p>
+          <w:p>
+            <w:pPr>
+              <w:spacing w:line="240" w:lineRule="auto" w:after="40"/>
+            </w:pPr>
+            <w:r>
+              <w:rPr>
+                <w:rFonts w:ascii="Times New Roman" w:hAnsi="Times New Roman"/>
+                <w:sz w:val="22"/>
+              </w:rPr>
+              <w:t xml:space="preserve">4. Gán ROLE_DOCTOR và lưu User + DoctorProfile</w:t>
+            </w:r>
+          </w:p>
+          <w:p>
+            <w:pPr>
+              <w:spacing w:line="240" w:lineRule="auto" w:after="40"/>
+            </w:pPr>
+            <w:r>
+              <w:rPr>
+                <w:rFonts w:ascii="Times New Roman" w:hAnsi="Times New Roman"/>
+                <w:sz w:val="22"/>
+              </w:rPr>
+              <w:t xml:space="preserve">5. Admin có thể cập nhật chuyên khoa, học hàm, kinh nghiệm, giá khám và bio</w:t>
             </w:r>
           </w:p>
         </w:tc>
@@ -15695,7 +15623,7 @@
                 <w:rFonts w:ascii="Times New Roman" w:hAnsi="Times New Roman"/>
                 <w:sz w:val="22"/>
               </w:rPr>
-              <w:t xml:space="preserve">Admin theo dõi báo cáo doanh thu và phân bổ ca khám thời gian thực</w:t>
+              <w:t xml:space="preserve">Admin theo dõi báo cáo doanh thu và phân bổ ca khám từ dữ liệu giao dịch hiện có</w:t>
             </w:r>
           </w:p>
         </w:tc>

</xml_diff>

<commit_message>
feat: bổ sung hàng chờ bác sĩ realtime bằng WebSocket
Triển khai Spring WebSocket/STOMP với user destination cho Doctor Desk; phát cập nhật CHECKED_IN, IN_PROGRESS và COMPLETED chỉ sau transaction commit. Bổ sung bảo mật endpoint, kiểm thử AFTER_COMMIT/rollback, cập nhật tài liệu và 3 DOCX liên quan.
</commit_message>
<xml_diff>
--- a/docs/generated/MedClinic_DacTaUseCase.docx
+++ b/docs/generated/MedClinic_DacTaUseCase.docx
@@ -8853,7 +8853,19 @@
                 <w:rFonts w:ascii="Times New Roman" w:hAnsi="Times New Roman"/>
                 <w:sz w:val="22"/>
               </w:rPr>
-              <w:t xml:space="preserve">6. Bệnh nhân tự động xuất hiện trên màn hình Bàn khám của bác sĩ chuyên khoa phụ trách</w:t>
+              <w:t xml:space="preserve">6. AppointmentService phát DoctorQueueChangedEvent; sau transaction commit, WebSocket/STOMP gửi user destination tới đúng tài khoản bác sĩ</w:t>
+            </w:r>
+          </w:p>
+          <w:p>
+            <w:pPr>
+              <w:spacing w:line="240" w:lineRule="auto" w:after="40"/>
+            </w:pPr>
+            <w:r>
+              <w:rPr>
+                <w:rFonts w:ascii="Times New Roman" w:hAnsi="Times New Roman"/>
+                <w:sz w:val="22"/>
+              </w:rPr>
+              <w:t xml:space="preserve">7. Doctor Desk nhận sự kiện và tự làm mới hàng chờ</w:t>
             </w:r>
           </w:p>
         </w:tc>
@@ -9819,43 +9831,67 @@
                 <w:rFonts w:ascii="Times New Roman" w:hAnsi="Times New Roman"/>
                 <w:sz w:val="22"/>
               </w:rPr>
-              <w:t xml:space="preserve">2. Hệ thống hiển thị hàng chờ bệnh nhân hôm nay theo thứ tự STT</w:t>
-            </w:r>
-          </w:p>
-          <w:p>
-            <w:pPr>
-              <w:spacing w:line="240" w:lineRule="auto" w:after="40"/>
-            </w:pPr>
-            <w:r>
-              <w:rPr>
-                <w:rFonts w:ascii="Times New Roman" w:hAnsi="Times New Roman"/>
-                <w:sz w:val="22"/>
-              </w:rPr>
-              <w:t xml:space="preserve">3. Bác sĩ bấm nút Khám Bệnh ở bệnh nhân đầu hàng chờ</w:t>
-            </w:r>
-          </w:p>
-          <w:p>
-            <w:pPr>
-              <w:spacing w:line="240" w:lineRule="auto" w:after="40"/>
-            </w:pPr>
-            <w:r>
-              <w:rPr>
-                <w:rFonts w:ascii="Times New Roman" w:hAnsi="Times New Roman"/>
-                <w:sz w:val="22"/>
-              </w:rPr>
-              <w:t xml:space="preserve">4. Trạng thái ca khám chuyển sang IN_PROGRESS</w:t>
-            </w:r>
-          </w:p>
-          <w:p>
-            <w:pPr>
-              <w:spacing w:line="240" w:lineRule="auto" w:after="40"/>
-            </w:pPr>
-            <w:r>
-              <w:rPr>
-                <w:rFonts w:ascii="Times New Roman" w:hAnsi="Times New Roman"/>
-                <w:sz w:val="22"/>
-              </w:rPr>
-              <w:t xml:space="preserve">5. Hệ thống chuyển hướng sang giao diện phòng khám bệnh án điện tử</w:t>
+              <w:t xml:space="preserve">2. Trình duyệt kết nối SockJS/STOMP và subscribe /user/queue/doctor</w:t>
+            </w:r>
+          </w:p>
+          <w:p>
+            <w:pPr>
+              <w:spacing w:line="240" w:lineRule="auto" w:after="40"/>
+            </w:pPr>
+            <w:r>
+              <w:rPr>
+                <w:rFonts w:ascii="Times New Roman" w:hAnsi="Times New Roman"/>
+                <w:sz w:val="22"/>
+              </w:rPr>
+              <w:t xml:space="preserve">3. Hệ thống hiển thị hàng chờ bệnh nhân hôm nay theo thứ tự STT</w:t>
+            </w:r>
+          </w:p>
+          <w:p>
+            <w:pPr>
+              <w:spacing w:line="240" w:lineRule="auto" w:after="40"/>
+            </w:pPr>
+            <w:r>
+              <w:rPr>
+                <w:rFonts w:ascii="Times New Roman" w:hAnsi="Times New Roman"/>
+                <w:sz w:val="22"/>
+              </w:rPr>
+              <w:t xml:space="preserve">4. Khi lễ tân check-in hoặc trạng thái ca khám đổi, sự kiện chỉ được broadcast AFTER_COMMIT và Doctor Desk tự làm mới</w:t>
+            </w:r>
+          </w:p>
+          <w:p>
+            <w:pPr>
+              <w:spacing w:line="240" w:lineRule="auto" w:after="40"/>
+            </w:pPr>
+            <w:r>
+              <w:rPr>
+                <w:rFonts w:ascii="Times New Roman" w:hAnsi="Times New Roman"/>
+                <w:sz w:val="22"/>
+              </w:rPr>
+              <w:t xml:space="preserve">5. Bác sĩ bấm nút Khám Bệnh ở bệnh nhân đầu hàng chờ</w:t>
+            </w:r>
+          </w:p>
+          <w:p>
+            <w:pPr>
+              <w:spacing w:line="240" w:lineRule="auto" w:after="40"/>
+            </w:pPr>
+            <w:r>
+              <w:rPr>
+                <w:rFonts w:ascii="Times New Roman" w:hAnsi="Times New Roman"/>
+                <w:sz w:val="22"/>
+              </w:rPr>
+              <w:t xml:space="preserve">6. Trạng thái ca khám chuyển sang IN_PROGRESS và sau commit phát cập nhật realtime</w:t>
+            </w:r>
+          </w:p>
+          <w:p>
+            <w:pPr>
+              <w:spacing w:line="240" w:lineRule="auto" w:after="40"/>
+            </w:pPr>
+            <w:r>
+              <w:rPr>
+                <w:rFonts w:ascii="Times New Roman" w:hAnsi="Times New Roman"/>
+                <w:sz w:val="22"/>
+              </w:rPr>
+              <w:t xml:space="preserve">7. Hệ thống chuyển hướng sang giao diện phòng khám bệnh án điện tử</w:t>
             </w:r>
           </w:p>
         </w:tc>

</xml_diff>